<commit_message>
docs(informe): actualiza el informe para reflejar los 3 clientes (Python, PHP, C#)
El enunciado (secciones 5 y 13) exige 3 clientes en 3 lenguajes distintos;
el informe original solo mencionaba Python y PHP. Actualiza Introduccion,
Objetivos especificos, Marco teorico (4.6), Arquitectura (5), Desarrollo
(6.5) y Analisis de resultados/Conclusiones para incluir C#.

Agrega:
- Placeholder de evidencia "Consola del cliente C#" (seccion 7.9)
- Nueva seccion 7.10 "Mapa interactivo del cliente C# (Leaflet)" con su
  propio placeholder de captura
- Referencia bibliografica de dotnet-svcutil (Microsoft, 2024)

La portada sigue con los placeholders [Apellido]/[Nombre del docente]
pendientes de completar con los datos reales.
</commit_message>
<xml_diff>
--- a/informe/informe_tecnico.docx
+++ b/informe/informe_tecnico.docx
@@ -211,7 +211,7 @@
           <w:sz w:val="22"/>
           <w:szCs w:val="22"/>
         </w:rPr>
-        <w:t xml:space="preserve">Este informe documenta el desarrollo de un sistema de gestión de productos construido sobre ese modelo: un servidor SOAP hecho en Node.js, con su propio archivo WSDL, capaz de registrar, consultar, listar, actualizar, valorizar y eliminar productos. Para comprobar que el contrato funciona sin importar el lenguaje del cliente, lo consumimos desde dos clientes completamente distintos —uno en Python y otro en PHP— y, ya entendiendo bien el protocolo, decidimos ir un poco más allá de lo mínimo exigido: le agregamos persistencia en una base de datos (Supabase), una API REST sobre el mismo backend para comparar ambos protocolos en la práctica, y una interfaz web para cada cliente. Todo lo que se describe a continuación fue construido, ejecutado y probado por el equipo; no es un ejercicio únicamente teórico.</w:t>
+        <w:t xml:space="preserve">Este informe documenta el desarrollo de un sistema de gestión de productos construido sobre ese modelo: un servidor SOAP hecho en Node.js, con su propio archivo WSDL, capaz de registrar, consultar, listar, actualizar, valorizar y eliminar productos. Para comprobar que el contrato funciona sin importar el lenguaje del cliente, lo consumimos desde tres clientes completamente distintos —Python, PHP y C#— y, ya entendiendo bien el protocolo, decidimos ir un poco más allá de lo mínimo exigido: le agregamos persistencia en una base de datos (Supabase), una API REST sobre el mismo backend para comparar ambos protocolos en la práctica, y una interfaz web para cada cliente. Todo lo que se describe a continuación fue construido, ejecutado y probado por el equipo; no es un ejercicio únicamente teórico.</w:t>
       </w:r>
     </w:p>
     <w:p>
@@ -293,7 +293,7 @@
           <w:sz w:val="22"/>
           <w:szCs w:val="22"/>
         </w:rPr>
-        <w:t xml:space="preserve">Desarrollar clientes en dos lenguajes de programación distintos —Python y PHP— capaces de consumir el mismo servicio sin modificarlo.</w:t>
+        <w:t xml:space="preserve">Desarrollar clientes en tres lenguajes de programación distintos —Python, PHP y C#— capaces de consumir el mismo servicio sin modificarlo.</w:t>
       </w:r>
     </w:p>
     <w:p>
@@ -485,7 +485,7 @@
           <w:sz w:val="22"/>
           <w:szCs w:val="22"/>
         </w:rPr>
-        <w:t xml:space="preserve">La arquitectura cliente-servidor divide un sistema en dos roles: el servidor, que concentra los datos y la lógica de negocio y espera solicitudes, y el cliente, que las envía y presenta los resultados. En nuestro proyecto el servidor es único (Node.js, con su lista de productos en memoria), pero tiene múltiples clientes que no se conocen entre sí: dos clientes de consola (Python y PHP) que demuestran las operaciones exigidas por la tarea, y dos paneles web —uno por cada lenguaje— construidos como mejora adicional. Ninguno de los clientes necesita saber cómo está implementado el servidor por dentro; les basta con el contrato que describe el WSDL.</w:t>
+        <w:t xml:space="preserve">La arquitectura cliente-servidor divide un sistema en dos roles: el servidor, que concentra los datos y la lógica de negocio y espera solicitudes, y el cliente, que las envía y presenta los resultados. En nuestro proyecto el servidor es único (Node.js, con su lista de productos en memoria), pero tiene múltiples clientes que no se conocen entre sí: tres clientes de consola (Python, PHP y C#) que demuestran las operaciones exigidas por la tarea, y dos paneles web —uno por cada lenguaje— construidos como mejora adicional; el cliente en C# suma además un mapa interactivo con Leaflet que ubica cada producto en su bodega. Ninguno de los clientes necesita saber cómo está implementado el servidor por dentro; les basta con el contrato que describe el WSDL.</w:t>
       </w:r>
     </w:p>
     <w:p>
@@ -617,7 +617,7 @@
           <w:sz w:val="22"/>
           <w:szCs w:val="22"/>
         </w:rPr>
-        <w:t xml:space="preserve">Sobre ese mismo servidor se apoyan cuatro clientes: dos de consola (cliente-python/client.py con la librería zeep, y cliente-php/client.php con la clase nativa SoapClient) que son los exigidos por el enunciado, y dos paneles web —uno por cada lenguaje— que construimos como mejora adicional para poder operar el servicio desde el navegador en lugar de la terminal.</w:t>
+        <w:t xml:space="preserve">Sobre ese mismo servidor se apoyan cinco clientes: tres de consola (cliente-python/client.py con la librería zeep, cliente-php/client.php con la clase nativa SoapClient, y cliente-csharp/Program.cs con un proxy generado por dotnet-svcutil sobre .NET) que son los exigidos por el enunciado, y dos paneles web —uno por cada lenguaje— que construimos como mejora adicional para poder operar el servicio desde el navegador en lugar de la terminal. El cliente en C# incluye además un mapa interactivo (Leaflet) que ubica cada producto en la bodega correspondiente a su categoría.</w:t>
       </w:r>
     </w:p>
     <w:p>
@@ -749,7 +749,7 @@
           <w:sz w:val="22"/>
           <w:szCs w:val="22"/>
         </w:rPr>
-        <w:t xml:space="preserve">Desarrollamos dos clientes de consola, uno por integrante asignado: client.py en Python, usando la librería zeep, que lee el WSDL y genera dinámicamente las funciones correspondientes a cada operación; y client.php en PHP, usando la clase nativa SoapClient, sin ninguna librería externa. Ambos ejecutan la misma secuencia de pruebas: registran dos productos, consultan uno existente y uno inexistente, listan el inventario, actualizan el stock de un producto, calculan el valor de su inventario y finalmente lo eliminan —incluyendo, en cada paso relevante, un intento con datos inválidos para comprobar que el servidor rechaza correctamente el caso incorrecto.</w:t>
+        <w:t xml:space="preserve">Desarrollamos tres clientes de consola: client.py en Python, usando la librería zeep, que lee el WSDL y genera dinámicamente las funciones correspondientes a cada operación; client.php en PHP, usando la clase nativa SoapClient, sin ninguna librería externa; y Program.cs en C#, usando un proxy generado con dotnet-svcutil (la herramienta de .NET equivalente a zeep o SoapClient) a partir del mismo WSDL. Los tres ejecutan la misma secuencia de pruebas: registran dos productos, consultan uno existente y uno inexistente, listan el inventario, actualizan el stock de un producto, calculan el valor de su inventario y finalmente lo eliminan —incluyendo, en cada paso relevante, un intento con datos inválidos para comprobar que el servidor rechaza correctamente el caso incorrecto. El cliente en C# suma, además, un mapa interactivo hecho con Leaflet: al listar los productos, agrupa cada uno en la bodega que corresponde a su categoría y lo muestra sobre un mapa de Ecuador, con un listado debajo donde se puede aislar la ubicación de un solo producto haciendo clic en su nombre.</w:t>
       </w:r>
     </w:p>
     <w:p>
@@ -1416,7 +1416,7 @@
           <w:sz w:val="22"/>
           <w:szCs w:val="22"/>
         </w:rPr>
-        <w:t xml:space="preserve">Con el servidor corriendo, cada cliente se ejecuta de forma independiente y muestra en su propia consola el resultado de las 7 demostraciones mínimas (registro, consulta existente/inexistente, listado, actualización de stock, cálculo de inventario y eliminación).</w:t>
+        <w:t xml:space="preserve">Con el servidor corriendo, cada uno de los tres clientes se ejecuta de forma independiente y muestra en su propia consola el resultado de las 7 demostraciones mínimas (registro, consulta existente/inexistente, listado, actualización de stock, cálculo de inventario y eliminación).</w:t>
       </w:r>
     </w:p>
     <w:tbl>
@@ -1538,6 +1538,155 @@
     </w:tbl>
     <w:p>
       <w:pPr>
+        <w:spacing w:after="180"/>
+      </w:pPr>
+    </w:p>
+    <w:tbl>
+      <w:tblPr>
+        <w:tblW w:type="pct" w:w="100%"/>
+        <w:tblBorders>
+          <w:top w:val="single" w:color="B5651D" w:sz="6"/>
+          <w:left w:val="single" w:color="B5651D" w:sz="6"/>
+          <w:bottom w:val="single" w:color="B5651D" w:sz="6"/>
+          <w:right w:val="single" w:color="B5651D" w:sz="6"/>
+          <w:insideH w:val="none" w:color="FFFFFF" w:sz="0"/>
+          <w:insideV w:val="none" w:color="FFFFFF" w:sz="0"/>
+        </w:tblBorders>
+      </w:tblPr>
+      <w:tblGrid>
+        <w:gridCol w:w="100"/>
+      </w:tblGrid>
+      <w:tr>
+        <w:tc>
+          <w:tcPr>
+            <w:shd w:fill="F7E9DA" w:val="clear"/>
+            <w:tcMar>
+              <w:top w:type="dxa" w:w="160"/>
+              <w:left w:type="dxa" w:w="200"/>
+              <w:bottom w:type="dxa" w:w="160"/>
+              <w:right w:type="dxa" w:w="200"/>
+            </w:tcMar>
+          </w:tcPr>
+          <w:p>
+            <w:pPr>
+              <w:spacing w:after="80"/>
+            </w:pPr>
+            <w:r>
+              <w:rPr>
+                <w:b/>
+                <w:bCs/>
+                <w:color w:val="B5651D"/>
+                <w:sz w:val="20"/>
+                <w:szCs w:val="20"/>
+              </w:rPr>
+              <w:t xml:space="preserve">[ESPACIO PARA CAPTURA]  Consola del cliente C#</w:t>
+            </w:r>
+          </w:p>
+          <w:p>
+            <w:r>
+              <w:rPr>
+                <w:i/>
+                <w:iCs/>
+                <w:color w:val="1E2622"/>
+                <w:sz w:val="19"/>
+                <w:szCs w:val="19"/>
+              </w:rPr>
+              <w:t xml:space="preserve">Ejecutar "dotnet run" dentro de cliente-csharp/ y capturar la salida completa en la terminal.</w:t>
+            </w:r>
+          </w:p>
+        </w:tc>
+      </w:tr>
+    </w:tbl>
+    <w:p>
+      <w:pPr>
+        <w:spacing w:after="260"/>
+      </w:pPr>
+    </w:p>
+    <w:p>
+      <w:pPr>
+        <w:pStyle w:val="Heading2"/>
+        <w:spacing w:after="140" w:before="300"/>
+      </w:pPr>
+      <w:r>
+        <w:t xml:space="preserve">7.10 Mapa interactivo del cliente C# (Leaflet)</w:t>
+      </w:r>
+    </w:p>
+    <w:p>
+      <w:pPr>
+        <w:spacing w:after="200" w:line="300"/>
+        <w:jc w:val="both"/>
+      </w:pPr>
+      <w:r>
+        <w:rPr>
+          <w:sz w:val="22"/>
+          <w:szCs w:val="22"/>
+        </w:rPr>
+        <w:t xml:space="preserve">A pedido del docente, el cliente en C# incorpora un mapa hecho con la librería Leaflet: al ejecutarlo (con "dotnet run" o, sin registrar ni borrar nada, con "dotnet run -- --mapa"), agrupa los productos existentes en la bodega correspondiente a su categoría y los ubica sobre un mapa de Ecuador con OpenStreetMap. Debajo del mapa se lista cada producto con su ubicación en texto, y al hacer clic en el nombre de un producto el mapa aísla su marcador; el botón "Mostrar todos" regresa a la vista completa.</w:t>
+      </w:r>
+    </w:p>
+    <w:tbl>
+      <w:tblPr>
+        <w:tblW w:type="pct" w:w="100%"/>
+        <w:tblBorders>
+          <w:top w:val="single" w:color="B5651D" w:sz="6"/>
+          <w:left w:val="single" w:color="B5651D" w:sz="6"/>
+          <w:bottom w:val="single" w:color="B5651D" w:sz="6"/>
+          <w:right w:val="single" w:color="B5651D" w:sz="6"/>
+          <w:insideH w:val="none" w:color="FFFFFF" w:sz="0"/>
+          <w:insideV w:val="none" w:color="FFFFFF" w:sz="0"/>
+        </w:tblBorders>
+      </w:tblPr>
+      <w:tblGrid>
+        <w:gridCol w:w="100"/>
+      </w:tblGrid>
+      <w:tr>
+        <w:tc>
+          <w:tcPr>
+            <w:shd w:fill="F7E9DA" w:val="clear"/>
+            <w:tcMar>
+              <w:top w:type="dxa" w:w="160"/>
+              <w:left w:type="dxa" w:w="200"/>
+              <w:bottom w:type="dxa" w:w="160"/>
+              <w:right w:type="dxa" w:w="200"/>
+            </w:tcMar>
+          </w:tcPr>
+          <w:p>
+            <w:pPr>
+              <w:spacing w:after="80"/>
+            </w:pPr>
+            <w:r>
+              <w:rPr>
+                <w:b/>
+                <w:bCs/>
+                <w:color w:val="B5651D"/>
+                <w:sz w:val="20"/>
+                <w:szCs w:val="20"/>
+              </w:rPr>
+              <w:t xml:space="preserve">[ESPACIO PARA CAPTURA]  Mapa de bodegas del cliente C#</w:t>
+            </w:r>
+          </w:p>
+          <w:p>
+            <w:r>
+              <w:rPr>
+                <w:i/>
+                <w:iCs/>
+                <w:color w:val="1E2622"/>
+                <w:sz w:val="19"/>
+                <w:szCs w:val="19"/>
+              </w:rPr>
+              <w:t xml:space="preserve">Capturar el navegador con el mapa abierto (generado por cliente-csharp/), mostrando al menos un marcador con su popup y la tabla de productos con su ubicación.</w:t>
+            </w:r>
+          </w:p>
+        </w:tc>
+      </w:tr>
+    </w:tbl>
+    <w:p>
+      <w:pPr>
+        <w:spacing w:after="260"/>
+      </w:pPr>
+    </w:p>
+    <w:p>
+      <w:pPr>
         <w:pStyle w:val="Heading1"/>
         <w:spacing w:after="200" w:before="420"/>
       </w:pPr>
@@ -1555,7 +1704,7 @@
           <w:sz w:val="22"/>
           <w:szCs w:val="22"/>
         </w:rPr>
-        <w:t xml:space="preserve">El servicio SOAP respondió de forma consistente a lo largo de todas las pruebas: las seis operaciones funcionan tanto desde SoapUI como desde los dos clientes de consola y los dos paneles web, y las validaciones de negocio se comportan igual sin importar por cuál de las dos vías —SOAP o REST— llegue la solicitud, gracias a que ambas comparten la misma capa de lógica (operaciones.js). Esto nos permitió confirmar en la práctica algo que solo habíamos leído en la teoría: un buen contrato de servicio (ya sea un WSDL o una API REST bien diseñada) permite que clientes completamente distintos —de consola o web, en Python o en PHP— interactúen con el mismo backend sin conocer los detalles de su implementación.</w:t>
+        <w:t xml:space="preserve">El servicio SOAP respondió de forma consistente a lo largo de todas las pruebas: las seis operaciones funcionan tanto desde SoapUI como desde los tres clientes de consola y los dos paneles web, y las validaciones de negocio se comportan igual sin importar por cuál de las dos vías —SOAP o REST— llegue la solicitud, gracias a que ambas comparten la misma capa de lógica (operaciones.js). Esto nos permitió confirmar en la práctica algo que solo habíamos leído en la teoría: un buen contrato de servicio (ya sea un WSDL o una API REST bien diseñada) permite que clientes completamente distintos —de consola o web, en Python o en PHP— interactúen con el mismo backend sin conocer los detalles de su implementación.</w:t>
       </w:r>
     </w:p>
     <w:p>
@@ -1624,7 +1773,7 @@
           <w:sz w:val="22"/>
           <w:szCs w:val="22"/>
         </w:rPr>
-        <w:t xml:space="preserve">Un WSDL bien definido es, en la práctica, más que documentación: es el contrato que hace posible que clientes en Python y PHP —que no comparten ni una línea de código entre sí— consuman exactamente el mismo servicio sin errores de interpretación.</w:t>
+        <w:t xml:space="preserve">Un WSDL bien definido es, en la práctica, más que documentación: es el contrato que hace posible que clientes en Python, PHP y C# —que no comparten ni una línea de código entre sí— consuman exactamente el mismo servicio sin errores de interpretación.</w:t>
       </w:r>
     </w:p>
     <w:p>
@@ -1784,6 +1933,19 @@
           <w:szCs w:val="21"/>
         </w:rPr>
         <w:t xml:space="preserve">Fielding, R. T. (2000). Architectural styles and the design of network-based software architectures [Tesis doctoral, University of California, Irvine]. https://ics.uci.edu/~fielding/pubs/dissertation/top.htm</w:t>
+      </w:r>
+    </w:p>
+    <w:p>
+      <w:pPr>
+        <w:spacing w:after="220" w:line="280"/>
+        <w:ind w:left="400" w:hanging="400"/>
+      </w:pPr>
+      <w:r>
+        <w:rPr>
+          <w:sz w:val="21"/>
+          <w:szCs w:val="21"/>
+        </w:rPr>
+        <w:t xml:space="preserve">Microsoft. (2024). dotnet-svcutil guide: Generate a WCF client from a WSDL. Microsoft Learn. https://learn.microsoft.com/dotnet/core/additional-tools/dotnet-svcutil-guide</w:t>
       </w:r>
     </w:p>
     <w:p>

</xml_diff>

<commit_message>
docs(informe): fusiona ediciones locales (nombres, capturas) con el contenido de Alexandra sobre el cliente C#
</commit_message>
<xml_diff>
--- a/informe/informe_tecnico.docx
+++ b/informe/informe_tecnico.docx
@@ -93,7 +93,7 @@
           <w:sz w:val="22"/>
           <w:szCs w:val="22"/>
         </w:rPr>
-        <w:t xml:space="preserve">Ismael [Apellido]</w:t>
+        <w:t xml:space="preserve">Ismael Vanegas</w:t>
       </w:r>
     </w:p>
     <w:p>
@@ -106,7 +106,7 @@
           <w:sz w:val="22"/>
           <w:szCs w:val="22"/>
         </w:rPr>
-        <w:t xml:space="preserve">Alexandra [Apellido]</w:t>
+        <w:t xml:space="preserve">Alexandra Caicedo</w:t>
       </w:r>
     </w:p>
     <w:p>
@@ -119,7 +119,7 @@
           <w:sz w:val="22"/>
           <w:szCs w:val="22"/>
         </w:rPr>
-        <w:t xml:space="preserve">Israel [Apellido]</w:t>
+        <w:t xml:space="preserve">Israel Arevalo</w:t>
       </w:r>
     </w:p>
     <w:p>
@@ -158,7 +158,7 @@
           <w:sz w:val="22"/>
           <w:szCs w:val="22"/>
         </w:rPr>
-        <w:t xml:space="preserve">Julio de 2026</w:t>
+        <w:t xml:space="preserve">Agosto de 2026</w:t>
       </w:r>
     </w:p>
     <w:p>
@@ -211,7 +211,7 @@
           <w:sz w:val="22"/>
           <w:szCs w:val="22"/>
         </w:rPr>
-        <w:t xml:space="preserve">Este informe documenta el desarrollo de un sistema de gestión de productos construido sobre ese modelo: un servidor SOAP hecho en Node.js, con su propio archivo WSDL, capaz de registrar, consultar, listar, actualizar, valorizar y eliminar productos. Para comprobar que el contrato funciona sin importar el lenguaje del cliente, lo consumimos desde tres clientes completamente distintos —Python, PHP y C#— y, ya entendiendo bien el protocolo, decidimos ir un poco más allá de lo mínimo exigido: le agregamos persistencia en una base de datos (Supabase), una API REST sobre el mismo backend para comparar ambos protocolos en la práctica, y una interfaz web para cada cliente. Todo lo que se describe a continuación fue construido, ejecutado y probado por el equipo; no es un ejercicio únicamente teórico.</w:t>
+        <w:t xml:space="preserve">Este informe documenta el desarrollo de un sistema de gestión de productos construido sobre ese modelo: un servidor SOAP hecho en Node.js, con su propio archivo WSDL, capaz de registrar, consultar, listar, actualizar, valorizar y eliminar productos. Para comprobar que el contrato funciona sin importar el lenguaje del cliente, lo consumimos desde tres clientes completamente distintos —Python, PHP y, como aporte individual de Alexandra, C#— y, ya entendiendo bien el protocolo, decidimos ir un poco más allá de lo mínimo exigido: le agregamos persistencia en una base de datos (Supabase), una API REST sobre el mismo backend para comparar ambos protocolos en la práctica, y una interfaz web para los clientes de Python y PHP. Todo lo que se describe a continuación fue construido, ejecutado y probado por el equipo; no es un ejercicio únicamente teórico.</w:t>
       </w:r>
     </w:p>
     <w:p>
@@ -310,7 +310,7 @@
           <w:sz w:val="22"/>
           <w:szCs w:val="22"/>
         </w:rPr>
-        <w:t xml:space="preserve">Intercambiar información estructurada mediante mensajes XML y comprobar, en la práctica, que el contrato definido en el WSDL se respeta en ambas direcciones.</w:t>
+        <w:t xml:space="preserve">Intercambiar información estructurada mediante mensajes XML y comprobar, en la práctica, que el contrato definido en el WSDL se respeta en todas direcciones.</w:t>
       </w:r>
     </w:p>
     <w:p>
@@ -419,7 +419,7 @@
           <w:sz w:val="22"/>
           <w:szCs w:val="22"/>
         </w:rPr>
-        <w:t xml:space="preserve">SOAP es un protocolo de mensajería basado en XML que define un formato estricto para el intercambio de información entre aplicaciones: cada mensaje viaja dentro de un "sobre" (Envelope) que contiene un encabezado opcional y un cuerpo (Body) con la solicitud o la respuesta. A diferencia de otros estilos de comunicación más flexibles, SOAP exige que la estructura de cada mensaje coincida exactamente con lo que el WSDL declaró; si el servidor incluye un dato que el contrato no definió, el mensaje deja de ser válido. Esto lo aprendimos de la peor manera: al agregar un campo adicional para identificar qué integrante había registrado cada producto, la librería que usamos terminó incluyéndolo también en las respuestas SOAP, rompiendo la conformidad del contrato. Tuvimos que separar explícitamente esa información para que solo viajara por la API REST, y dejar el SOAP tal como el WSDL lo describe.</w:t>
+        <w:t xml:space="preserve">SOAP es un protocolo de mensajería basado en XML que define un formato estricto para el intercambio de información entre aplicaciones: cada mensaje viaja dentro de un “sobre” (Envelope) que contiene un encabezado opcional y un cuerpo (Body) con la solicitud o la respuesta. A diferencia de otros estilos de comunicación más flexibles, SOAP exige que la estructura de cada mensaje coincida exactamente con lo que el WSDL declaró; si el servidor incluye un dato que el contrato no definió, el mensaje deja de ser válido. Esto lo aprendimos de la peor manera: al agregar un campo adicional para identificar qué integrante había registrado cada producto, la librería que usamos terminó incluyéndolo también en las respuestas SOAP, rompiendo la conformidad del contrato. Tuvimos que separar explícitamente esa información para que solo viajara por la API REST, y dejar el SOAP tal como el WSDL lo describe.</w:t>
       </w:r>
     </w:p>
     <w:p>
@@ -463,7 +463,7 @@
           <w:sz w:val="22"/>
           <w:szCs w:val="22"/>
         </w:rPr>
-        <w:t xml:space="preserve">El WSDL es el documento que describe formalmente un servicio SOAP: qué operaciones ofrece, qué tipos de datos usa cada una (types), qué mensajes de entrada y salida corresponden a cada operación (message y portType), cómo se transportan esos mensajes (binding) y en qué dirección de red se puede acceder al servicio (service y port). En este proyecto escribimos el archivo productos.wsdl a mano, definiendo las seis operaciones exigidas por el enunciado, y lo dejamos accesible desde el navegador en http://localhost:8000/productos?wsdl, tal como pide la tarea. Ese mismo archivo es el que SoapUI necesita para generar automáticamente las solicitudes de prueba, y el que las librerías cliente (zeep en Python, SoapClient en PHP) leen para saber qué operaciones pueden invocar.</w:t>
+        <w:t xml:space="preserve">El WSDL es el documento que describe formalmente un servicio SOAP: qué operaciones ofrece, qué tipos de datos usa cada una (types), qué mensajes de entrada y salida corresponden a cada operación (message y portType), cómo se transportan esos mensajes (binding) y en qué dirección de red se puede acceder al servicio (service y port). En este proyecto escribimos el archivo productos.wsdl a mano, definiendo las seis operaciones exigidas por el enunciado, y lo dejamos accesible desde el navegador en http://localhost:8000/productos?wsdl, tal como pide la tarea. Ese mismo archivo es el que SoapUI necesita para generar automáticamente las solicitudes de prueba, y el que las librerías cliente (zeep en Python, SoapClient en PHP, y el proxy generado por dotnet-svcutil en C#) leen para saber qué operaciones pueden invocar.</w:t>
       </w:r>
     </w:p>
     <w:p>
@@ -485,7 +485,7 @@
           <w:sz w:val="22"/>
           <w:szCs w:val="22"/>
         </w:rPr>
-        <w:t xml:space="preserve">La arquitectura cliente-servidor divide un sistema en dos roles: el servidor, que concentra los datos y la lógica de negocio y espera solicitudes, y el cliente, que las envía y presenta los resultados. En nuestro proyecto el servidor es único (Node.js, con su lista de productos en memoria), pero tiene múltiples clientes que no se conocen entre sí: tres clientes de consola (Python, PHP y C#) que demuestran las operaciones exigidas por la tarea, y dos paneles web —uno por cada lenguaje— construidos como mejora adicional; el cliente en C# suma además un mapa interactivo con Leaflet que ubica cada producto en su bodega. Ninguno de los clientes necesita saber cómo está implementado el servidor por dentro; les basta con el contrato que describe el WSDL.</w:t>
+        <w:t xml:space="preserve">La arquitectura cliente-servidor divide un sistema en dos roles: el servidor, que concentra los datos y la lógica de negocio y espera solicitudes, y el cliente, que las envía y presenta los resultados. En nuestro proyecto el servidor es único (Node.js, con su lista de productos en memoria), pero tiene múltiples clientes que no se conocen entre sí: tres clientes de consola (Python, PHP y C#) que demuestran las operaciones exigidas por la tarea, dos paneles web —uno en Python, otro en PHP— construidos como mejora adicional, y un mapa interactivo generado por el cliente en C# como aporte individual de Alexandra. Ninguno de los clientes necesita saber cómo está implementado el servidor por dentro; les basta con el contrato que describe el WSDL.</w:t>
       </w:r>
     </w:p>
     <w:p>
@@ -529,7 +529,7 @@
           <w:sz w:val="22"/>
           <w:szCs w:val="22"/>
         </w:rPr>
-        <w:t xml:space="preserve">El diagrama siguiente resume cómo está organizado el sistema tal como quedó al final del desarrollo. Cada integrante del equipo corre su propia instancia local del servidor Node.js (puerto 8000), que expone el mismo contrato SOAP y la misma API REST; las tres instancias comparten una única base de datos en Supabase, que actúa como persistencia adicional sobre la lista en memoria de cada servidor.</w:t>
+        <w:t xml:space="preserve">El diagrama siguiente resume cómo está organizado el sistema compartido por el equipo. Cada integrante corre su propia instancia local del servidor Node.js (puerto 8000), que expone el mismo contrato SOAP y la misma API REST; las tres instancias comparten una única base de datos en Supabase, que actúa como persistencia adicional sobre la lista en memoria de cada servidor.</w:t>
       </w:r>
     </w:p>
     <w:p>
@@ -540,7 +540,7 @@
       <w:r>
         <w:drawing>
           <wp:inline distT="0" distB="0" distL="0" distR="0">
-            <wp:extent cx="5334000" cy="3467100"/>
+            <wp:extent cx="5334000" cy="4076700"/>
             <wp:effectExtent t="0" r="0" b="0" l="0"/>
             <wp:docPr id="1" name="" descr="" title=""/>
             <wp:cNvGraphicFramePr>
@@ -565,7 +565,7 @@
                   <pic:spPr bwMode="auto">
                     <a:xfrm>
                       <a:off x="0" y="0"/>
-                      <a:ext cx="5334000" cy="3467100"/>
+                      <a:ext cx="5334000" cy="4076700"/>
                     </a:xfrm>
                     <a:prstGeom prst="rect">
                       <a:avLst/>
@@ -617,7 +617,7 @@
           <w:sz w:val="22"/>
           <w:szCs w:val="22"/>
         </w:rPr>
-        <w:t xml:space="preserve">Sobre ese mismo servidor se apoyan cinco clientes: tres de consola (cliente-python/client.py con la librería zeep, cliente-php/client.php con la clase nativa SoapClient, y cliente-csharp/Program.cs con un proxy generado por dotnet-svcutil sobre .NET) que son los exigidos por el enunciado, y dos paneles web —uno por cada lenguaje— que construimos como mejora adicional para poder operar el servicio desde el navegador en lugar de la terminal. El cliente en C# incluye además un mapa interactivo (Leaflet) que ubica cada producto en la bodega correspondiente a su categoría.</w:t>
+        <w:t xml:space="preserve">Sobre ese mismo servidor se apoyan cinco clientes: tres de consola (cliente-python/client.py con la librería zeep, cliente-php/client.php con la clase nativa SoapClient, y cliente-csharp/Program.cs con un proxy generado por dotnet-svcutil) que demuestran las operaciones exigidas por el enunciado, y dos paneles web —uno por cada lenguaje con framework web— que construimos como mejora adicional. El cliente en C# es un aporte individual de Alexandra para su entrega personal: usa el mismo WSDL compartido, pero no forma parte del despliegue idéntico en las tres instancias como sí ocurre con Python y PHP.</w:t>
       </w:r>
     </w:p>
     <w:p>
@@ -683,7 +683,7 @@
           <w:sz w:val="22"/>
           <w:szCs w:val="22"/>
         </w:rPr>
-        <w:t xml:space="preserve">Antes de escribir una sola línea del servidor, definimos el contrato: creamos productos.wsdl declarando el tipo complejo Producto (código, nombre, categoría, precio, cantidad) y, para cada una de las seis operaciones, su mensaje de entrada, su mensaje de salida, la entrada en el portType, y su asociación al binding SOAP sobre HTTP. Al probarlo por primera vez con node-soap nos topamos con un error de "comentario mal formado": habíamos usado líneas decorativas con guiones dobles (--) dentro de comentarios XML, algo que la especificación XML prohíbe explícitamente. Corregirlo nos obligó a entender que un WSDL, al final, es un documento XML como cualquier otro y hereda todas sus reglas.</w:t>
+        <w:t xml:space="preserve">Antes de escribir una sola línea del servidor, definimos el contrato: creamos productos.wsdl declarando el tipo complejo Producto (código, nombre, categoría, precio, cantidad) y, para cada una de las seis operaciones, su mensaje de entrada, su mensaje de salida, la entrada en el portType, y su asociación al binding SOAP sobre HTTP. Al probarlo por primera vez con node-soap nos topamos con un error de “comentario mal formado”: habíamos usado líneas decorativas con guiones dobles (--) dentro de comentarios XML, algo que la especificación XML prohíbe explícitamente. Corregirlo nos obligó a entender que un WSDL, al final, es un documento XML como cualquier otro y hereda todas sus reglas.</w:t>
       </w:r>
     </w:p>
     <w:p>
@@ -736,29 +736,51 @@
         <w:spacing w:after="140" w:before="300"/>
       </w:pPr>
       <w:r>
-        <w:t xml:space="preserve">6.5 Implementación de los clientes</w:t>
-      </w:r>
-    </w:p>
-    <w:p>
-      <w:pPr>
-        <w:spacing w:after="200" w:line="300"/>
-        <w:jc w:val="both"/>
-      </w:pPr>
-      <w:r>
-        <w:rPr>
-          <w:sz w:val="22"/>
-          <w:szCs w:val="22"/>
-        </w:rPr>
-        <w:t xml:space="preserve">Desarrollamos tres clientes de consola: client.py en Python, usando la librería zeep, que lee el WSDL y genera dinámicamente las funciones correspondientes a cada operación; client.php en PHP, usando la clase nativa SoapClient, sin ninguna librería externa; y Program.cs en C#, usando un proxy generado con dotnet-svcutil (la herramienta de .NET equivalente a zeep o SoapClient) a partir del mismo WSDL. Los tres ejecutan la misma secuencia de pruebas: registran dos productos, consultan uno existente y uno inexistente, listan el inventario, actualizan el stock de un producto, calculan el valor de su inventario y finalmente lo eliminan —incluyendo, en cada paso relevante, un intento con datos inválidos para comprobar que el servidor rechaza correctamente el caso incorrecto. El cliente en C# suma, además, un mapa interactivo hecho con Leaflet: al listar los productos, agrupa cada uno en la bodega que corresponde a su categoría y lo muestra sobre un mapa de Ecuador, con un listado debajo donde se puede aislar la ubicación de un solo producto haciendo clic en su nombre.</w:t>
-      </w:r>
-    </w:p>
-    <w:p>
-      <w:pPr>
-        <w:pStyle w:val="Heading2"/>
-        <w:spacing w:after="140" w:before="300"/>
-      </w:pPr>
-      <w:r>
-        <w:t xml:space="preserve">6.6 API REST y paneles web (mejora adicional)</w:t>
+        <w:t xml:space="preserve">6.5 Implementación de los clientes de consola</w:t>
+      </w:r>
+    </w:p>
+    <w:p>
+      <w:pPr>
+        <w:spacing w:after="200" w:line="300"/>
+        <w:jc w:val="both"/>
+      </w:pPr>
+      <w:r>
+        <w:rPr>
+          <w:sz w:val="22"/>
+          <w:szCs w:val="22"/>
+        </w:rPr>
+        <w:t xml:space="preserve">Desarrollamos tres clientes de consola: client.py en Python, usando la librería zeep, que lee el WSDL y genera dinámicamente las funciones correspondientes a cada operación; client.php en PHP, usando la clase nativa SoapClient, sin ninguna librería externa; y Program.cs en C#, usando un proxy generado con la herramienta dotnet-svcutil a partir del mismo WSDL. Los tres ejecutan la misma secuencia de pruebas: registran dos productos, consultan uno existente y uno inexistente, listan el inventario, actualizan el stock de un producto, calculan el valor de su inventario y finalmente lo eliminan —incluyendo, en cada paso relevante, un intento con datos inválidos para comprobar que el servidor rechaza correctamente el caso incorrecto.</w:t>
+      </w:r>
+    </w:p>
+    <w:p>
+      <w:pPr>
+        <w:pStyle w:val="Heading2"/>
+        <w:spacing w:after="140" w:before="300"/>
+      </w:pPr>
+      <w:r>
+        <w:t xml:space="preserve">6.6 Cliente en C# y mapa interactivo (aporte individual de Alexandra)</w:t>
+      </w:r>
+    </w:p>
+    <w:p>
+      <w:pPr>
+        <w:spacing w:after="200" w:line="300"/>
+        <w:jc w:val="both"/>
+      </w:pPr>
+      <w:r>
+        <w:rPr>
+          <w:sz w:val="22"/>
+          <w:szCs w:val="22"/>
+        </w:rPr>
+        <w:t xml:space="preserve">Para su entrega individual, Alexandra construyó un cuarto cliente en C# (.NET) que, además de las 7 demostraciones mínimas, genera un mapa interactivo con la librería Leaflet: cada categoría de producto se ubica en una bodega o tienda real (Quito, Guayaquil, Cuenca, Ambato), y el mapa se abre automáticamente en el navegador como un archivo HTML independiente (mapa_productos.html). Una decisión de diseño importante: el mapeo categoría-bodega vive únicamente dentro del cliente C# (en MapaBodegas.cs), sin agregar ningún campo nuevo al WSDL, a las validaciones ni a la tabla productos de Supabase — esa es infraestructura compartida por los tres integrantes, y una mejora individual no debía modificarla.</w:t>
+      </w:r>
+    </w:p>
+    <w:p>
+      <w:pPr>
+        <w:pStyle w:val="Heading2"/>
+        <w:spacing w:after="140" w:before="300"/>
+      </w:pPr>
+      <w:r>
+        <w:t xml:space="preserve">6.7 API REST y paneles web (mejora adicional)</w:t>
       </w:r>
     </w:p>
     <w:p>
@@ -780,7 +802,7 @@
         <w:spacing w:after="140" w:before="300"/>
       </w:pPr>
       <w:r>
-        <w:t xml:space="preserve">6.7 Pruebas</w:t>
+        <w:t xml:space="preserve">6.8 Pruebas</w:t>
       </w:r>
     </w:p>
     <w:p>
@@ -1266,66 +1288,67 @@
         <w:t xml:space="preserve">El servidor se levanta con npm start desde la carpeta servidor/ y muestra en consola la hidratación desde Supabase, la dirección del servicio SOAP y de la API REST, y cada operación ejecutada con su resultado.</w:t>
       </w:r>
     </w:p>
-    <w:tbl>
-      <w:tblPr>
-        <w:tblW w:type="pct" w:w="100%"/>
-        <w:tblBorders>
-          <w:top w:val="single" w:color="B5651D" w:sz="6"/>
-          <w:left w:val="single" w:color="B5651D" w:sz="6"/>
-          <w:bottom w:val="single" w:color="B5651D" w:sz="6"/>
-          <w:right w:val="single" w:color="B5651D" w:sz="6"/>
-          <w:insideH w:val="none" w:color="FFFFFF" w:sz="0"/>
-          <w:insideV w:val="none" w:color="FFFFFF" w:sz="0"/>
-        </w:tblBorders>
-      </w:tblPr>
-      <w:tblGrid>
-        <w:gridCol w:w="100"/>
-      </w:tblGrid>
-      <w:tr>
-        <w:tc>
-          <w:tcPr>
-            <w:shd w:fill="F7E9DA" w:val="clear"/>
-            <w:tcMar>
-              <w:top w:type="dxa" w:w="160"/>
-              <w:left w:type="dxa" w:w="200"/>
-              <w:bottom w:type="dxa" w:w="160"/>
-              <w:right w:type="dxa" w:w="200"/>
-            </w:tcMar>
-          </w:tcPr>
-          <w:p>
-            <w:pPr>
-              <w:spacing w:after="80"/>
-            </w:pPr>
-            <w:r>
-              <w:rPr>
-                <w:b/>
-                <w:bCs/>
-                <w:color w:val="B5651D"/>
-                <w:sz w:val="20"/>
-                <w:szCs w:val="20"/>
-              </w:rPr>
-              <w:t xml:space="preserve">[ESPACIO PARA CAPTURA]  Terminal con el servidor corriendo</w:t>
-            </w:r>
-          </w:p>
-          <w:p>
-            <w:r>
-              <w:rPr>
-                <w:i/>
-                <w:iCs/>
-                <w:color w:val="1E2622"/>
-                <w:sz w:val="19"/>
-                <w:szCs w:val="19"/>
-              </w:rPr>
-              <w:t xml:space="preserve">Ejecutar "npm start" dentro de servidor/ y capturar la consola mostrando las líneas "Servidor SOAP escuchando...", "WSDL disponible..." y "API REST disponible...".</w:t>
-            </w:r>
-          </w:p>
-        </w:tc>
-      </w:tr>
-    </w:tbl>
-    <w:p>
-      <w:pPr>
-        <w:spacing w:after="260"/>
-      </w:pPr>
+    <w:p>
+      <w:pPr>
+        <w:spacing w:after="60" w:before="160"/>
+        <w:jc w:val="center"/>
+      </w:pPr>
+      <w:r>
+        <w:drawing>
+          <wp:inline distT="0" distB="0" distL="0" distR="0">
+            <wp:extent cx="4381500" cy="1314450"/>
+            <wp:effectExtent t="0" r="0" b="0" l="0"/>
+            <wp:docPr id="1" name="" descr="" title=""/>
+            <wp:cNvGraphicFramePr>
+              <a:graphicFrameLocks xmlns:a="http://schemas.openxmlformats.org/drawingml/2006/main" noChangeAspect="1"/>
+            </wp:cNvGraphicFramePr>
+            <a:graphic xmlns:a="http://schemas.openxmlformats.org/drawingml/2006/main">
+              <a:graphicData uri="http://schemas.openxmlformats.org/drawingml/2006/picture">
+                <pic:pic xmlns:pic="http://schemas.openxmlformats.org/drawingml/2006/picture">
+                  <pic:nvPicPr>
+                    <pic:cNvPr id="0" name="" descr=""/>
+                    <pic:cNvPicPr>
+                      <a:picLocks noChangeAspect="1" noChangeArrowheads="1"/>
+                    </pic:cNvPicPr>
+                  </pic:nvPicPr>
+                  <pic:blipFill>
+                    <a:blip r:embed="rId15" cstate="none"/>
+                    <a:srcRect/>
+                    <a:stretch>
+                      <a:fillRect/>
+                    </a:stretch>
+                  </pic:blipFill>
+                  <pic:spPr bwMode="auto">
+                    <a:xfrm>
+                      <a:off x="0" y="0"/>
+                      <a:ext cx="4381500" cy="1314450"/>
+                    </a:xfrm>
+                    <a:prstGeom prst="rect">
+                      <a:avLst/>
+                    </a:prstGeom>
+                  </pic:spPr>
+                </pic:pic>
+              </a:graphicData>
+            </a:graphic>
+          </wp:inline>
+        </w:drawing>
+      </w:r>
+    </w:p>
+    <w:p>
+      <w:pPr>
+        <w:spacing w:after="320" w:before="80"/>
+        <w:jc w:val="center"/>
+      </w:pPr>
+      <w:r>
+        <w:rPr>
+          <w:i/>
+          <w:iCs/>
+          <w:color w:val="5B665F"/>
+          <w:sz w:val="19"/>
+          <w:szCs w:val="19"/>
+        </w:rPr>
+        <w:t xml:space="preserve">Figura 8. Consola del servidor tras "npm start": WSDL y API REST disponibles.</w:t>
+      </w:r>
     </w:p>
     <w:p>
       <w:pPr>
@@ -1336,271 +1359,226 @@
         <w:t xml:space="preserve">7.8 Acceso al WSDL desde el navegador</w:t>
       </w:r>
     </w:p>
-    <w:tbl>
-      <w:tblPr>
-        <w:tblW w:type="pct" w:w="100%"/>
-        <w:tblBorders>
-          <w:top w:val="single" w:color="B5651D" w:sz="6"/>
-          <w:left w:val="single" w:color="B5651D" w:sz="6"/>
-          <w:bottom w:val="single" w:color="B5651D" w:sz="6"/>
-          <w:right w:val="single" w:color="B5651D" w:sz="6"/>
-          <w:insideH w:val="none" w:color="FFFFFF" w:sz="0"/>
-          <w:insideV w:val="none" w:color="FFFFFF" w:sz="0"/>
-        </w:tblBorders>
-      </w:tblPr>
-      <w:tblGrid>
-        <w:gridCol w:w="100"/>
-      </w:tblGrid>
-      <w:tr>
-        <w:tc>
-          <w:tcPr>
-            <w:shd w:fill="F7E9DA" w:val="clear"/>
-            <w:tcMar>
-              <w:top w:type="dxa" w:w="160"/>
-              <w:left w:type="dxa" w:w="200"/>
-              <w:bottom w:type="dxa" w:w="160"/>
-              <w:right w:type="dxa" w:w="200"/>
-            </w:tcMar>
-          </w:tcPr>
-          <w:p>
-            <w:pPr>
-              <w:spacing w:after="80"/>
-            </w:pPr>
-            <w:r>
-              <w:rPr>
-                <w:b/>
-                <w:bCs/>
-                <w:color w:val="B5651D"/>
-                <w:sz w:val="20"/>
-                <w:szCs w:val="20"/>
-              </w:rPr>
-              <w:t xml:space="preserve">[ESPACIO PARA CAPTURA]  Navegador mostrando el WSDL</w:t>
-            </w:r>
-          </w:p>
-          <w:p>
-            <w:r>
-              <w:rPr>
-                <w:i/>
-                <w:iCs/>
-                <w:color w:val="1E2622"/>
-                <w:sz w:val="19"/>
-                <w:szCs w:val="19"/>
-              </w:rPr>
-              <w:t xml:space="preserve">Abrir http://localhost:8000/productos?wsdl en el navegador (con el servidor corriendo) y capturar el XML completo que se muestra.</w:t>
-            </w:r>
-          </w:p>
-        </w:tc>
-      </w:tr>
-    </w:tbl>
-    <w:p>
-      <w:pPr>
-        <w:spacing w:after="260"/>
-      </w:pPr>
-    </w:p>
-    <w:p>
-      <w:pPr>
-        <w:pStyle w:val="Heading2"/>
-        <w:spacing w:after="140" w:before="300"/>
-      </w:pPr>
-      <w:r>
-        <w:t xml:space="preserve">7.9 Ejecución de los clientes</w:t>
-      </w:r>
-    </w:p>
-    <w:p>
-      <w:pPr>
-        <w:spacing w:after="200" w:line="300"/>
-        <w:jc w:val="both"/>
-      </w:pPr>
-      <w:r>
-        <w:rPr>
-          <w:sz w:val="22"/>
-          <w:szCs w:val="22"/>
-        </w:rPr>
-        <w:t xml:space="preserve">Con el servidor corriendo, cada uno de los tres clientes se ejecuta de forma independiente y muestra en su propia consola el resultado de las 7 demostraciones mínimas (registro, consulta existente/inexistente, listado, actualización de stock, cálculo de inventario y eliminación).</w:t>
-      </w:r>
-    </w:p>
-    <w:tbl>
-      <w:tblPr>
-        <w:tblW w:type="pct" w:w="100%"/>
-        <w:tblBorders>
-          <w:top w:val="single" w:color="B5651D" w:sz="6"/>
-          <w:left w:val="single" w:color="B5651D" w:sz="6"/>
-          <w:bottom w:val="single" w:color="B5651D" w:sz="6"/>
-          <w:right w:val="single" w:color="B5651D" w:sz="6"/>
-          <w:insideH w:val="none" w:color="FFFFFF" w:sz="0"/>
-          <w:insideV w:val="none" w:color="FFFFFF" w:sz="0"/>
-        </w:tblBorders>
-      </w:tblPr>
-      <w:tblGrid>
-        <w:gridCol w:w="100"/>
-      </w:tblGrid>
-      <w:tr>
-        <w:tc>
-          <w:tcPr>
-            <w:shd w:fill="F7E9DA" w:val="clear"/>
-            <w:tcMar>
-              <w:top w:type="dxa" w:w="160"/>
-              <w:left w:type="dxa" w:w="200"/>
-              <w:bottom w:type="dxa" w:w="160"/>
-              <w:right w:type="dxa" w:w="200"/>
-            </w:tcMar>
-          </w:tcPr>
-          <w:p>
-            <w:pPr>
-              <w:spacing w:after="80"/>
-            </w:pPr>
-            <w:r>
-              <w:rPr>
-                <w:b/>
-                <w:bCs/>
-                <w:color w:val="B5651D"/>
-                <w:sz w:val="20"/>
-                <w:szCs w:val="20"/>
-              </w:rPr>
-              <w:t xml:space="preserve">[ESPACIO PARA CAPTURA]  Consola del cliente Python</w:t>
-            </w:r>
-          </w:p>
-          <w:p>
-            <w:r>
-              <w:rPr>
-                <w:i/>
-                <w:iCs/>
-                <w:color w:val="1E2622"/>
-                <w:sz w:val="19"/>
-                <w:szCs w:val="19"/>
-              </w:rPr>
-              <w:t xml:space="preserve">Ejecutar "python client.py" dentro de cliente-python/ y capturar la salida completa en la terminal.</w:t>
-            </w:r>
-          </w:p>
-        </w:tc>
-      </w:tr>
-    </w:tbl>
-    <w:p>
-      <w:pPr>
-        <w:spacing w:after="180"/>
-      </w:pPr>
-    </w:p>
-    <w:tbl>
-      <w:tblPr>
-        <w:tblW w:type="pct" w:w="100%"/>
-        <w:tblBorders>
-          <w:top w:val="single" w:color="B5651D" w:sz="6"/>
-          <w:left w:val="single" w:color="B5651D" w:sz="6"/>
-          <w:bottom w:val="single" w:color="B5651D" w:sz="6"/>
-          <w:right w:val="single" w:color="B5651D" w:sz="6"/>
-          <w:insideH w:val="none" w:color="FFFFFF" w:sz="0"/>
-          <w:insideV w:val="none" w:color="FFFFFF" w:sz="0"/>
-        </w:tblBorders>
-      </w:tblPr>
-      <w:tblGrid>
-        <w:gridCol w:w="100"/>
-      </w:tblGrid>
-      <w:tr>
-        <w:tc>
-          <w:tcPr>
-            <w:shd w:fill="F7E9DA" w:val="clear"/>
-            <w:tcMar>
-              <w:top w:type="dxa" w:w="160"/>
-              <w:left w:type="dxa" w:w="200"/>
-              <w:bottom w:type="dxa" w:w="160"/>
-              <w:right w:type="dxa" w:w="200"/>
-            </w:tcMar>
-          </w:tcPr>
-          <w:p>
-            <w:pPr>
-              <w:spacing w:after="80"/>
-            </w:pPr>
-            <w:r>
-              <w:rPr>
-                <w:b/>
-                <w:bCs/>
-                <w:color w:val="B5651D"/>
-                <w:sz w:val="20"/>
-                <w:szCs w:val="20"/>
-              </w:rPr>
-              <w:t xml:space="preserve">[ESPACIO PARA CAPTURA]  Consola del cliente PHP</w:t>
-            </w:r>
-          </w:p>
-          <w:p>
-            <w:r>
-              <w:rPr>
-                <w:i/>
-                <w:iCs/>
-                <w:color w:val="1E2622"/>
-                <w:sz w:val="19"/>
-                <w:szCs w:val="19"/>
-              </w:rPr>
-              <w:t xml:space="preserve">Ejecutar "php client.php" dentro de cliente-php/ y capturar la salida completa en la terminal.</w:t>
-            </w:r>
-          </w:p>
-        </w:tc>
-      </w:tr>
-    </w:tbl>
-    <w:p>
-      <w:pPr>
-        <w:spacing w:after="180"/>
-      </w:pPr>
-    </w:p>
-    <w:tbl>
-      <w:tblPr>
-        <w:tblW w:type="pct" w:w="100%"/>
-        <w:tblBorders>
-          <w:top w:val="single" w:color="B5651D" w:sz="6"/>
-          <w:left w:val="single" w:color="B5651D" w:sz="6"/>
-          <w:bottom w:val="single" w:color="B5651D" w:sz="6"/>
-          <w:right w:val="single" w:color="B5651D" w:sz="6"/>
-          <w:insideH w:val="none" w:color="FFFFFF" w:sz="0"/>
-          <w:insideV w:val="none" w:color="FFFFFF" w:sz="0"/>
-        </w:tblBorders>
-      </w:tblPr>
-      <w:tblGrid>
-        <w:gridCol w:w="100"/>
-      </w:tblGrid>
-      <w:tr>
-        <w:tc>
-          <w:tcPr>
-            <w:shd w:fill="F7E9DA" w:val="clear"/>
-            <w:tcMar>
-              <w:top w:type="dxa" w:w="160"/>
-              <w:left w:type="dxa" w:w="200"/>
-              <w:bottom w:type="dxa" w:w="160"/>
-              <w:right w:type="dxa" w:w="200"/>
-            </w:tcMar>
-          </w:tcPr>
-          <w:p>
-            <w:pPr>
-              <w:spacing w:after="80"/>
-            </w:pPr>
-            <w:r>
-              <w:rPr>
-                <w:b/>
-                <w:bCs/>
-                <w:color w:val="B5651D"/>
-                <w:sz w:val="20"/>
-                <w:szCs w:val="20"/>
-              </w:rPr>
-              <w:t xml:space="preserve">[ESPACIO PARA CAPTURA]  Consola del cliente C#</w:t>
-            </w:r>
-          </w:p>
-          <w:p>
-            <w:r>
-              <w:rPr>
-                <w:i/>
-                <w:iCs/>
-                <w:color w:val="1E2622"/>
-                <w:sz w:val="19"/>
-                <w:szCs w:val="19"/>
-              </w:rPr>
-              <w:t xml:space="preserve">Ejecutar "dotnet run" dentro de cliente-csharp/ y capturar la salida completa en la terminal.</w:t>
-            </w:r>
-          </w:p>
-        </w:tc>
-      </w:tr>
-    </w:tbl>
-    <w:p>
-      <w:pPr>
-        <w:spacing w:after="260"/>
-      </w:pPr>
+    <w:p>
+      <w:pPr>
+        <w:spacing w:after="200" w:line="300"/>
+        <w:jc w:val="both"/>
+      </w:pPr>
+      <w:r>
+        <w:rPr>
+          <w:sz w:val="22"/>
+          <w:szCs w:val="22"/>
+        </w:rPr>
+        <w:t xml:space="preserve">http://localhost:8000/productos?wsdl</w:t>
+      </w:r>
+    </w:p>
+    <w:p>
+      <w:pPr>
+        <w:spacing w:after="60" w:before="160"/>
+        <w:jc w:val="center"/>
+      </w:pPr>
+      <w:r>
+        <w:drawing>
+          <wp:inline distT="0" distB="0" distL="0" distR="0">
+            <wp:extent cx="3143250" cy="3771900"/>
+            <wp:effectExtent t="0" r="0" b="0" l="0"/>
+            <wp:docPr id="1" name="" descr="" title=""/>
+            <wp:cNvGraphicFramePr>
+              <a:graphicFrameLocks xmlns:a="http://schemas.openxmlformats.org/drawingml/2006/main" noChangeAspect="1"/>
+            </wp:cNvGraphicFramePr>
+            <a:graphic xmlns:a="http://schemas.openxmlformats.org/drawingml/2006/main">
+              <a:graphicData uri="http://schemas.openxmlformats.org/drawingml/2006/picture">
+                <pic:pic xmlns:pic="http://schemas.openxmlformats.org/drawingml/2006/picture">
+                  <pic:nvPicPr>
+                    <pic:cNvPr id="0" name="" descr=""/>
+                    <pic:cNvPicPr>
+                      <a:picLocks noChangeAspect="1" noChangeArrowheads="1"/>
+                    </pic:cNvPicPr>
+                  </pic:nvPicPr>
+                  <pic:blipFill>
+                    <a:blip r:embed="rId16" cstate="none"/>
+                    <a:srcRect/>
+                    <a:stretch>
+                      <a:fillRect/>
+                    </a:stretch>
+                  </pic:blipFill>
+                  <pic:spPr bwMode="auto">
+                    <a:xfrm>
+                      <a:off x="0" y="0"/>
+                      <a:ext cx="3143250" cy="3771900"/>
+                    </a:xfrm>
+                    <a:prstGeom prst="rect">
+                      <a:avLst/>
+                    </a:prstGeom>
+                  </pic:spPr>
+                </pic:pic>
+              </a:graphicData>
+            </a:graphic>
+          </wp:inline>
+        </w:drawing>
+      </w:r>
+    </w:p>
+    <w:p>
+      <w:pPr>
+        <w:spacing w:after="320" w:before="80"/>
+        <w:jc w:val="center"/>
+      </w:pPr>
+      <w:r>
+        <w:rPr>
+          <w:i/>
+          <w:iCs/>
+          <w:color w:val="5B665F"/>
+          <w:sz w:val="19"/>
+          <w:szCs w:val="19"/>
+        </w:rPr>
+        <w:t xml:space="preserve">Figura 9. El documento WSDL completo, accesible directamente desde el navegador.</w:t>
+      </w:r>
+    </w:p>
+    <w:p>
+      <w:pPr>
+        <w:pStyle w:val="Heading2"/>
+        <w:spacing w:after="140" w:before="300"/>
+      </w:pPr>
+      <w:r>
+        <w:t xml:space="preserve">7.9 Paneles web — Python y PHP</w:t>
+      </w:r>
+    </w:p>
+    <w:p>
+      <w:pPr>
+        <w:spacing w:after="200" w:line="300"/>
+        <w:jc w:val="both"/>
+      </w:pPr>
+      <w:r>
+        <w:rPr>
+          <w:sz w:val="22"/>
+          <w:szCs w:val="22"/>
+        </w:rPr>
+        <w:t xml:space="preserve">Ambos paneles consumen el mismo WSDL y muestran, en su barra lateral, con qué instancia del servidor están hablando y quién registró cada producto (columna Origen), demostrando el uso conjunto de SOAP (para las operaciones) y REST (para el equipo y la instancia).</w:t>
+      </w:r>
+    </w:p>
+    <w:p>
+      <w:pPr>
+        <w:spacing w:after="60" w:before="160"/>
+        <w:jc w:val="center"/>
+      </w:pPr>
+      <w:r>
+        <w:drawing>
+          <wp:inline distT="0" distB="0" distL="0" distR="0">
+            <wp:extent cx="4572000" cy="2667000"/>
+            <wp:effectExtent t="0" r="0" b="0" l="0"/>
+            <wp:docPr id="1" name="" descr="" title=""/>
+            <wp:cNvGraphicFramePr>
+              <a:graphicFrameLocks xmlns:a="http://schemas.openxmlformats.org/drawingml/2006/main" noChangeAspect="1"/>
+            </wp:cNvGraphicFramePr>
+            <a:graphic xmlns:a="http://schemas.openxmlformats.org/drawingml/2006/main">
+              <a:graphicData uri="http://schemas.openxmlformats.org/drawingml/2006/picture">
+                <pic:pic xmlns:pic="http://schemas.openxmlformats.org/drawingml/2006/picture">
+                  <pic:nvPicPr>
+                    <pic:cNvPr id="0" name="" descr=""/>
+                    <pic:cNvPicPr>
+                      <a:picLocks noChangeAspect="1" noChangeArrowheads="1"/>
+                    </pic:cNvPicPr>
+                  </pic:nvPicPr>
+                  <pic:blipFill>
+                    <a:blip r:embed="rId17" cstate="none"/>
+                    <a:srcRect/>
+                    <a:stretch>
+                      <a:fillRect/>
+                    </a:stretch>
+                  </pic:blipFill>
+                  <pic:spPr bwMode="auto">
+                    <a:xfrm>
+                      <a:off x="0" y="0"/>
+                      <a:ext cx="4572000" cy="2667000"/>
+                    </a:xfrm>
+                    <a:prstGeom prst="rect">
+                      <a:avLst/>
+                    </a:prstGeom>
+                  </pic:spPr>
+                </pic:pic>
+              </a:graphicData>
+            </a:graphic>
+          </wp:inline>
+        </w:drawing>
+      </w:r>
+    </w:p>
+    <w:p>
+      <w:pPr>
+        <w:spacing w:after="320" w:before="80"/>
+        <w:jc w:val="center"/>
+      </w:pPr>
+      <w:r>
+        <w:rPr>
+          <w:i/>
+          <w:iCs/>
+          <w:color w:val="5B665F"/>
+          <w:sz w:val="19"/>
+          <w:szCs w:val="19"/>
+        </w:rPr>
+        <w:t xml:space="preserve">Figura 10. Panel web del cliente Python (Flask + zeep).</w:t>
+      </w:r>
+    </w:p>
+    <w:p>
+      <w:pPr>
+        <w:spacing w:after="60" w:before="160"/>
+        <w:jc w:val="center"/>
+      </w:pPr>
+      <w:r>
+        <w:drawing>
+          <wp:inline distT="0" distB="0" distL="0" distR="0">
+            <wp:extent cx="4572000" cy="2695575"/>
+            <wp:effectExtent t="0" r="0" b="0" l="0"/>
+            <wp:docPr id="1" name="" descr="" title=""/>
+            <wp:cNvGraphicFramePr>
+              <a:graphicFrameLocks xmlns:a="http://schemas.openxmlformats.org/drawingml/2006/main" noChangeAspect="1"/>
+            </wp:cNvGraphicFramePr>
+            <a:graphic xmlns:a="http://schemas.openxmlformats.org/drawingml/2006/main">
+              <a:graphicData uri="http://schemas.openxmlformats.org/drawingml/2006/picture">
+                <pic:pic xmlns:pic="http://schemas.openxmlformats.org/drawingml/2006/picture">
+                  <pic:nvPicPr>
+                    <pic:cNvPr id="0" name="" descr=""/>
+                    <pic:cNvPicPr>
+                      <a:picLocks noChangeAspect="1" noChangeArrowheads="1"/>
+                    </pic:cNvPicPr>
+                  </pic:nvPicPr>
+                  <pic:blipFill>
+                    <a:blip r:embed="rId18" cstate="none"/>
+                    <a:srcRect/>
+                    <a:stretch>
+                      <a:fillRect/>
+                    </a:stretch>
+                  </pic:blipFill>
+                  <pic:spPr bwMode="auto">
+                    <a:xfrm>
+                      <a:off x="0" y="0"/>
+                      <a:ext cx="4572000" cy="2695575"/>
+                    </a:xfrm>
+                    <a:prstGeom prst="rect">
+                      <a:avLst/>
+                    </a:prstGeom>
+                  </pic:spPr>
+                </pic:pic>
+              </a:graphicData>
+            </a:graphic>
+          </wp:inline>
+        </w:drawing>
+      </w:r>
+    </w:p>
+    <w:p>
+      <w:pPr>
+        <w:spacing w:after="320" w:before="80"/>
+        <w:jc w:val="center"/>
+      </w:pPr>
+      <w:r>
+        <w:rPr>
+          <w:i/>
+          <w:iCs/>
+          <w:color w:val="5B665F"/>
+          <w:sz w:val="19"/>
+          <w:szCs w:val="19"/>
+        </w:rPr>
+        <w:t xml:space="preserve">Figura 11. Panel web del cliente PHP (SoapClient nativo).</w:t>
+      </w:r>
     </w:p>
     <w:p>
       <w:pPr>
@@ -1621,69 +1599,8 @@
           <w:sz w:val="22"/>
           <w:szCs w:val="22"/>
         </w:rPr>
-        <w:t xml:space="preserve">A pedido del docente, el cliente en C# incorpora un mapa hecho con la librería Leaflet: al ejecutarlo (con "dotnet run" o, sin registrar ni borrar nada, con "dotnet run -- --mapa"), agrupa los productos existentes en la bodega correspondiente a su categoría y los ubica sobre un mapa de Ecuador con OpenStreetMap. Debajo del mapa se lista cada producto con su ubicación en texto, y al hacer clic en el nombre de un producto el mapa aísla su marcador; el botón "Mostrar todos" regresa a la vista completa.</w:t>
-      </w:r>
-    </w:p>
-    <w:tbl>
-      <w:tblPr>
-        <w:tblW w:type="pct" w:w="100%"/>
-        <w:tblBorders>
-          <w:top w:val="single" w:color="B5651D" w:sz="6"/>
-          <w:left w:val="single" w:color="B5651D" w:sz="6"/>
-          <w:bottom w:val="single" w:color="B5651D" w:sz="6"/>
-          <w:right w:val="single" w:color="B5651D" w:sz="6"/>
-          <w:insideH w:val="none" w:color="FFFFFF" w:sz="0"/>
-          <w:insideV w:val="none" w:color="FFFFFF" w:sz="0"/>
-        </w:tblBorders>
-      </w:tblPr>
-      <w:tblGrid>
-        <w:gridCol w:w="100"/>
-      </w:tblGrid>
-      <w:tr>
-        <w:tc>
-          <w:tcPr>
-            <w:shd w:fill="F7E9DA" w:val="clear"/>
-            <w:tcMar>
-              <w:top w:type="dxa" w:w="160"/>
-              <w:left w:type="dxa" w:w="200"/>
-              <w:bottom w:type="dxa" w:w="160"/>
-              <w:right w:type="dxa" w:w="200"/>
-            </w:tcMar>
-          </w:tcPr>
-          <w:p>
-            <w:pPr>
-              <w:spacing w:after="80"/>
-            </w:pPr>
-            <w:r>
-              <w:rPr>
-                <w:b/>
-                <w:bCs/>
-                <w:color w:val="B5651D"/>
-                <w:sz w:val="20"/>
-                <w:szCs w:val="20"/>
-              </w:rPr>
-              <w:t xml:space="preserve">[ESPACIO PARA CAPTURA]  Mapa de bodegas del cliente C#</w:t>
-            </w:r>
-          </w:p>
-          <w:p>
-            <w:r>
-              <w:rPr>
-                <w:i/>
-                <w:iCs/>
-                <w:color w:val="1E2622"/>
-                <w:sz w:val="19"/>
-                <w:szCs w:val="19"/>
-              </w:rPr>
-              <w:t xml:space="preserve">Capturar el navegador con el mapa abierto (generado por cliente-csharp/), mostrando al menos un marcador con su popup y la tabla de productos con su ubicación.</w:t>
-            </w:r>
-          </w:p>
-        </w:tc>
-      </w:tr>
-    </w:tbl>
-    <w:p>
-      <w:pPr>
-        <w:spacing w:after="260"/>
-      </w:pPr>
+        <w:t xml:space="preserve">A pedido del docente, el cliente en C# incorpora un mapa hecho con la librería Leaflet: al ejecutarlo (con "dotnet run" o, sin registrar ni borrar nada, con "dotnet run -- --mapa") se genera un archivo mapa_productos.html que se abre automáticamente en el navegador, ubicando cada producto en la bodega o tienda que corresponde a su categoría. Esta evidencia es parte de la entrega individual de Alexandra; una captura del mapa en funcionamiento puede agregarse aquí antes de la entrega final.</w:t>
+      </w:r>
     </w:p>
     <w:p>
       <w:pPr>
@@ -1704,7 +1621,7 @@
           <w:sz w:val="22"/>
           <w:szCs w:val="22"/>
         </w:rPr>
-        <w:t xml:space="preserve">El servicio SOAP respondió de forma consistente a lo largo de todas las pruebas: las seis operaciones funcionan tanto desde SoapUI como desde los tres clientes de consola y los dos paneles web, y las validaciones de negocio se comportan igual sin importar por cuál de las dos vías —SOAP o REST— llegue la solicitud, gracias a que ambas comparten la misma capa de lógica (operaciones.js). Esto nos permitió confirmar en la práctica algo que solo habíamos leído en la teoría: un buen contrato de servicio (ya sea un WSDL o una API REST bien diseñada) permite que clientes completamente distintos —de consola o web, en Python o en PHP— interactúen con el mismo backend sin conocer los detalles de su implementación.</w:t>
+        <w:t xml:space="preserve">El servicio SOAP respondió de forma consistente a lo largo de todas las pruebas: las seis operaciones funcionan tanto desde SoapUI como desde los tres clientes de consola y los dos paneles web, y las validaciones de negocio se comportan igual sin importar por cuál de las dos vías —SOAP o REST— llegue la solicitud, gracias a que ambas comparten la misma capa de lógica (operaciones.js). Esto nos permitió confirmar en la práctica algo que solo habíamos leído en la teoría: un buen contrato de servicio (ya sea un WSDL o una API REST bien diseñada) permite que clientes completamente distintos —de consola o web, en Python, PHP o C#— interactúen con el mismo backend sin conocer los detalles de su implementación.</w:t>
       </w:r>
     </w:p>
     <w:p>
@@ -1730,7 +1647,7 @@
           <w:sz w:val="22"/>
           <w:szCs w:val="22"/>
         </w:rPr>
-        <w:t xml:space="preserve">Trabajar con tres integrantes corriendo cada uno su propio servidor local, apuntando a la misma base de datos compartida en Supabase, también puso a prueba un supuesto que dábamos por sentado: que "nuestros datos" eran solo nuestros. Más de una vez, al listar productos, aparecían registros de prueba de otro integrante. Resolverlo (con la columna origen y el identificador de instancia) terminó siendo, sin haberlo planeado, una lección adicional sobre los problemas reales de compartir estado entre sistemas distribuidos.</w:t>
+        <w:t xml:space="preserve">Trabajar con tres integrantes corriendo cada uno su propio servidor local, apuntando a la misma base de datos compartida en Supabase, también puso a prueba un supuesto que dábamos por sentado: que “nuestros datos” eran solo nuestros. Más de una vez, al listar productos, aparecían registros de prueba de otro integrante. Resolverlo (con la columna origen y el identificador de instancia) terminó siendo, sin haberlo planeado, una lección adicional sobre los problemas reales de compartir estado entre sistemas distribuidos.</w:t>
       </w:r>
     </w:p>
     <w:p>
@@ -1824,7 +1741,7 @@
           <w:sz w:val="22"/>
           <w:szCs w:val="22"/>
         </w:rPr>
-        <w:t xml:space="preserve">Ir más allá del mínimo exigido —agregando la API REST y los paneles web— terminó siendo la parte que más nos ayudó a entender las diferencias reales entre SOAP y REST, más que cualquier lectura teórica previa.</w:t>
+        <w:t xml:space="preserve">Ir más allá del mínimo exigido —agregando la API REST, los paneles web y un cuarto cliente en C# con mapa interactivo— terminó siendo la parte que más nos ayudó a entender las diferencias reales entre SOAP y REST, más que cualquier lectura teórica previa.</w:t>
       </w:r>
     </w:p>
     <w:p>
@@ -1884,7 +1801,7 @@
           <w:sz w:val="22"/>
           <w:szCs w:val="22"/>
         </w:rPr>
-        <w:t xml:space="preserve">Para proyectos futuros similares, valdría la pena agregar autenticación básica a los paneles web antes de considerarlos listos para un entorno que no sea de desarrollo local, ya que en esta versión cualquiera con acceso a la red puede registrar o eliminar productos sin restricción.</w:t>
+        <w:t xml:space="preserve">Cuando un integrante agrega una mejora individual (como el cliente en C#), mantener cualquier dato específico de esa mejora fuera del esquema compartido — evita que un cambio pensado para la entrega de una persona afecte el trabajo del resto del equipo.</w:t>
       </w:r>
     </w:p>
     <w:p>
@@ -1933,19 +1850,6 @@
           <w:szCs w:val="21"/>
         </w:rPr>
         <w:t xml:space="preserve">Fielding, R. T. (2000). Architectural styles and the design of network-based software architectures [Tesis doctoral, University of California, Irvine]. https://ics.uci.edu/~fielding/pubs/dissertation/top.htm</w:t>
-      </w:r>
-    </w:p>
-    <w:p>
-      <w:pPr>
-        <w:spacing w:after="220" w:line="280"/>
-        <w:ind w:left="400" w:hanging="400"/>
-      </w:pPr>
-      <w:r>
-        <w:rPr>
-          <w:sz w:val="21"/>
-          <w:szCs w:val="21"/>
-        </w:rPr>
-        <w:t xml:space="preserve">Microsoft. (2024). dotnet-svcutil guide: Generate a WCF client from a WSDL. Microsoft Learn. https://learn.microsoft.com/dotnet/core/additional-tools/dotnet-svcutil-guide</w:t>
       </w:r>
     </w:p>
     <w:p>

</xml_diff>